<commit_message>
Actualizar .gitignore y ajustes menores de configuración
Ignorar directorio build/ y main.pdf del raíz. Ajuste en .latexmkrc.
Actualización de diagrama de estados del sistema.
</commit_message>
<xml_diff>
--- a/diagrama_estados_sistema.docx
+++ b/diagrama_estados_sistema.docx
@@ -16,22 +16,31 @@
           <w:sz w:val="28"/>
           <w:lang w:val="es-MX"/>
         </w:rPr>
-        <w:t>Máquina de Estados Global — Ciclo de Vida del Experimento FST</w:t>
+        <w:t>Máquina de Estados G</w:t>
       </w:r>
-    </w:p>
-    <w:p>
-      <w:pPr>
-        <w:spacing w:after="0"/>
-        <w:jc w:val="center"/>
-      </w:pPr>
+      <w:r>
+        <w:rPr>
+          <w:b/>
+          <w:sz w:val="28"/>
+          <w:lang w:val="es-MX"/>
+        </w:rPr>
+        <w:t>loba</w:t>
+      </w:r>
+      <w:r>
+        <w:rPr>
+          <w:b/>
+          <w:sz w:val="28"/>
+          <w:lang w:val="es-MX"/>
+        </w:rPr>
+        <w:t>l — Ciclo de Vida del Experimento FST</w:t>
+      </w:r>
       <w:r>
         <w:rPr>
           <w:noProof/>
         </w:rPr>
-        <w:lastRenderedPageBreak/>
         <w:drawing>
-          <wp:inline distT="0" distB="0" distL="0" distR="0" wp14:anchorId="59B7286E" wp14:editId="26BE2788">
-            <wp:extent cx="5774055" cy="9972040"/>
+          <wp:inline distT="0" distB="0" distL="0" distR="0" wp14:anchorId="645609C1" wp14:editId="31E99419">
+            <wp:extent cx="5585423" cy="9646920"/>
             <wp:effectExtent l="0" t="0" r="0" b="0"/>
             <wp:docPr id="9822971" name="Imagen 1"/>
             <wp:cNvGraphicFramePr>
@@ -62,7 +71,7 @@
                   <pic:spPr bwMode="auto">
                     <a:xfrm>
                       <a:off x="0" y="0"/>
-                      <a:ext cx="5774055" cy="9972040"/>
+                      <a:ext cx="5596745" cy="9666475"/>
                     </a:xfrm>
                     <a:prstGeom prst="rect">
                       <a:avLst/>
@@ -78,6 +87,12 @@
           </wp:inline>
         </w:drawing>
       </w:r>
+    </w:p>
+    <w:p>
+      <w:pPr>
+        <w:spacing w:after="0"/>
+        <w:jc w:val="center"/>
+      </w:pPr>
       <w:r>
         <w:rPr>
           <w:noProof/>
@@ -122,7 +137,7 @@
     </w:p>
     <w:sectPr>
       <w:pgSz w:w="11906" w:h="16838"/>
-      <w:pgMar w:top="567" w:right="567" w:bottom="567" w:left="567" w:header="720" w:footer="720" w:gutter="0"/>
+      <w:pgMar w:top="284" w:right="567" w:bottom="567" w:left="567" w:header="720" w:footer="720" w:gutter="0"/>
       <w:cols w:space="720"/>
       <w:docGrid w:linePitch="360"/>
     </w:sectPr>

</xml_diff>